<commit_message>
Add/update resource data for BiblicaOpenNewArabicVersion2012
</commit_message>
<xml_diff>
--- a/arb/docx/01.content.docx
+++ b/arb/docx/01.content.docx
@@ -32,23 +32,6 @@
     </w:p>
     <w:p>
       <w:pPr>
-        <w:pStyle w:val="Heading2"/>
-        <w:bidi/>
-      </w:pPr>
-      <w:r>
-        <w:rPr>
-          <w:lang w:val="ar_AE" w:bidi="ar_AE"/>
-        </w:rPr>
-        <w:t>License Information</w:t>
-      </w:r>
-      <w:r>
-        <w:rPr>
-          <w:lang w:val="ar_AE" w:bidi="ar_AE"/>
-        </w:rPr>
-      </w:r>
-    </w:p>
-    <w:p>
-      <w:pPr>
         <w:bidi/>
       </w:pPr>
       <w:r>
@@ -67,13 +50,7 @@
         <w:rPr>
           <w:lang w:val="ar_AE" w:bidi="ar_AE"/>
         </w:rPr>
-        <w:t xml:space="preserve"> (Arabic) is based on</w:t>
-      </w:r>
-      <w:r>
-        <w:rPr>
-          <w:lang w:val="ar_AE" w:bidi="ar_AE"/>
-        </w:rPr>
-        <w:t xml:space="preserve">: </w:t>
+        <w:t xml:space="preserve"> (Arabic) is based on: </w:t>
       </w:r>
       <w:r>
         <w:rPr>
@@ -200,21 +177,6 @@
         <w:pStyle w:val="Heading2"/>
         <w:bidi/>
       </w:pPr>
-      <w:r>
-        <w:rPr>
-          <w:lang w:val="ar_AE" w:bidi="ar_AE"/>
-        </w:rPr>
-      </w:r>
-    </w:p>
-    <w:p>
-      <w:pPr>
-        <w:bidi/>
-      </w:pPr>
-      <w:r>
-        <w:rPr>
-          <w:lang w:val="ar_AE" w:bidi="ar_AE"/>
-        </w:rPr>
-      </w:r>
       <w:r>
         <w:rPr>
           <w:lang w:val="ar_AE" w:bidi="ar_AE"/>

</xml_diff>